<commit_message>
Resume: new PDF and DOCX with the portfolio link, phone number removed
The new files add adrianluk.com to the header and reword two bullets
(Control D SSO, agency marketing site); the site copy now matches them.

Co-Authored-By: Claude Opus 5.5 <noreply@anthropic.com>
Claude-Session: https://claude.ai/code/session_01RiNmEGqg5oNikRscmim6tb
</commit_message>
<xml_diff>
--- a/public/Adrian-Luk-Resume-2026.docx
+++ b/public/Adrian-Luk-Resume-2026.docx
@@ -4,7 +4,7 @@
   <w:body>
     <w:p>
       <w:pPr>
-        <w:spacing w:after="70"/>
+        <w:spacing w:after="40"/>
         <w:jc w:val="center"/>
       </w:pPr>
       <w:r>
@@ -13,18 +13,19 @@
           <w:b/>
           <w:bCs/>
           <w:color w:val="1B4F9C"/>
-          <w:sz w:val="36"/>
-          <w:szCs w:val="36"/>
+          <w:spacing w:val="50"/>
+          <w:sz w:val="34"/>
+          <w:szCs w:val="34"/>
         </w:rPr>
         <w:t xml:space="preserve">ADRIAN LUK</w:t>
       </w:r>
     </w:p>
     <w:p>
       <w:pPr>
-        <w:spacing w:after="20"/>
+        <w:spacing w:after="0"/>
         <w:jc w:val="center"/>
       </w:pPr>
-      <w:hyperlink w:history="1" r:id="rIdxhsjv1rs_bcb1esxcyvpp">
+      <w:hyperlink w:history="1" r:id="rIdgashd1mo32fizv_b8kyvd">
         <w:r>
           <w:rPr>
             <w:rFonts w:ascii="Calibri" w:cs="Calibri" w:eastAsia="Calibri" w:hAnsi="Calibri"/>
@@ -56,10 +57,30 @@
     </w:p>
     <w:p>
       <w:pPr>
-        <w:spacing w:after="20"/>
+        <w:spacing w:after="0"/>
         <w:jc w:val="center"/>
       </w:pPr>
-      <w:hyperlink w:history="1" r:id="rIdxyzbryxulmo1g6zl6tmuz">
+      <w:hyperlink w:history="1" r:id="rIdltlrtvbzievqfex7jtp_y">
+        <w:r>
+          <w:rPr>
+            <w:rFonts w:ascii="Calibri" w:cs="Calibri" w:eastAsia="Calibri" w:hAnsi="Calibri"/>
+            <w:color w:val="1B4F9C"/>
+            <w:sz w:val="19"/>
+            <w:szCs w:val="19"/>
+          </w:rPr>
+          <w:t xml:space="preserve">adrianluk.com</w:t>
+        </w:r>
+      </w:hyperlink>
+      <w:r>
+        <w:rPr>
+          <w:rFonts w:ascii="Calibri" w:cs="Calibri" w:eastAsia="Calibri" w:hAnsi="Calibri"/>
+          <w:color w:val="333333"/>
+          <w:sz w:val="19"/>
+          <w:szCs w:val="19"/>
+        </w:rPr>
+        <w:t xml:space="preserve">  |  </w:t>
+      </w:r>
+      <w:hyperlink w:history="1" r:id="rId9rhbpqma2rnk5jyba19gw">
         <w:r>
           <w:rPr>
             <w:rFonts w:ascii="Calibri" w:cs="Calibri" w:eastAsia="Calibri" w:hAnsi="Calibri"/>
@@ -79,7 +100,7 @@
         </w:rPr>
         <w:t xml:space="preserve">  |  </w:t>
       </w:r>
-      <w:hyperlink w:history="1" r:id="rIdbtlu_nc1rzx20brasxh5l">
+      <w:hyperlink w:history="1" r:id="rIdc04fp8vzbudg6hrqnzg7-">
         <w:r>
           <w:rPr>
             <w:rFonts w:ascii="Calibri" w:cs="Calibri" w:eastAsia="Calibri" w:hAnsi="Calibri"/>
@@ -97,7 +118,7 @@
         <w:pBdr>
           <w:bottom w:val="single" w:color="1B4F9C" w:sz="8" w:space="3"/>
         </w:pBdr>
-        <w:spacing w:after="110" w:before="240"/>
+        <w:spacing w:after="140" w:before="240"/>
       </w:pPr>
       <w:r>
         <w:rPr>
@@ -105,6 +126,7 @@
           <w:b/>
           <w:bCs/>
           <w:color w:val="1B4F9C"/>
+          <w:spacing w:val="30"/>
           <w:sz w:val="22"/>
           <w:szCs w:val="22"/>
         </w:rPr>
@@ -113,7 +135,7 @@
     </w:p>
     <w:p>
       <w:pPr>
-        <w:spacing w:after="45" w:line="240"/>
+        <w:spacing w:after="0"/>
       </w:pPr>
       <w:r>
         <w:rPr>
@@ -130,7 +152,7 @@
         <w:pBdr>
           <w:bottom w:val="single" w:color="1B4F9C" w:sz="8" w:space="3"/>
         </w:pBdr>
-        <w:spacing w:after="110" w:before="240"/>
+        <w:spacing w:after="140" w:before="240"/>
       </w:pPr>
       <w:r>
         <w:rPr>
@@ -138,6 +160,7 @@
           <w:b/>
           <w:bCs/>
           <w:color w:val="1B4F9C"/>
+          <w:spacing w:val="30"/>
           <w:sz w:val="22"/>
           <w:szCs w:val="22"/>
         </w:rPr>
@@ -146,7 +169,7 @@
     </w:p>
     <w:p>
       <w:pPr>
-        <w:spacing w:after="45"/>
+        <w:spacing w:after="50"/>
       </w:pPr>
       <w:r>
         <w:rPr>
@@ -170,7 +193,7 @@
     </w:p>
     <w:p>
       <w:pPr>
-        <w:spacing w:after="45"/>
+        <w:spacing w:after="50"/>
       </w:pPr>
       <w:r>
         <w:rPr>
@@ -194,7 +217,7 @@
     </w:p>
     <w:p>
       <w:pPr>
-        <w:spacing w:after="45"/>
+        <w:spacing w:after="50"/>
       </w:pPr>
       <w:r>
         <w:rPr>
@@ -218,7 +241,7 @@
     </w:p>
     <w:p>
       <w:pPr>
-        <w:spacing w:after="45"/>
+        <w:spacing w:after="50"/>
       </w:pPr>
       <w:r>
         <w:rPr>
@@ -242,7 +265,7 @@
     </w:p>
     <w:p>
       <w:pPr>
-        <w:spacing w:after="45"/>
+        <w:spacing w:after="50"/>
       </w:pPr>
       <w:r>
         <w:rPr>
@@ -270,7 +293,7 @@
         <w:pBdr>
           <w:bottom w:val="single" w:color="1B4F9C" w:sz="8" w:space="3"/>
         </w:pBdr>
-        <w:spacing w:after="110" w:before="240"/>
+        <w:spacing w:after="140" w:before="240"/>
       </w:pPr>
       <w:r>
         <w:rPr>
@@ -278,6 +301,7 @@
           <w:b/>
           <w:bCs/>
           <w:color w:val="1B4F9C"/>
+          <w:spacing w:val="30"/>
           <w:sz w:val="22"/>
           <w:szCs w:val="22"/>
         </w:rPr>
@@ -287,7 +311,188 @@
     <w:p>
       <w:pPr>
         <w:keepNext/>
-        <w:keepLines/>
+        <w:tabs>
+          <w:tab w:val="right" w:pos="10368"/>
+        </w:tabs>
+        <w:spacing w:after="0" w:before="0"/>
+      </w:pPr>
+      <w:r>
+        <w:rPr>
+          <w:rFonts w:ascii="Calibri" w:cs="Calibri" w:eastAsia="Calibri" w:hAnsi="Calibri"/>
+          <w:b/>
+          <w:bCs/>
+          <w:sz w:val="20"/>
+          <w:szCs w:val="20"/>
+        </w:rPr>
+        <w:t xml:space="preserve">Senior Software Engineer, </w:t>
+      </w:r>
+      <w:r>
+        <w:rPr>
+          <w:rFonts w:ascii="Calibri" w:cs="Calibri" w:eastAsia="Calibri" w:hAnsi="Calibri"/>
+          <w:b/>
+          <w:bCs/>
+          <w:color w:val="1B4F9C"/>
+          <w:sz w:val="20"/>
+          <w:szCs w:val="20"/>
+        </w:rPr>
+        <w:t xml:space="preserve">Control D (Windscribe)</w:t>
+      </w:r>
+      <w:r>
+        <w:rPr>
+          <w:rFonts w:ascii="Calibri" w:cs="Calibri" w:eastAsia="Calibri" w:hAnsi="Calibri"/>
+          <w:color w:val="555555"/>
+          <w:sz w:val="19"/>
+          <w:szCs w:val="19"/>
+        </w:rPr>
+        <w:t xml:space="preserve">	Mar 2024 - Apr 2026</w:t>
+      </w:r>
+    </w:p>
+    <w:p>
+      <w:pPr>
+        <w:keepNext/>
+        <w:spacing w:after="60"/>
+      </w:pPr>
+      <w:r>
+        <w:rPr>
+          <w:rFonts w:ascii="Calibri" w:cs="Calibri" w:eastAsia="Calibri" w:hAnsi="Calibri"/>
+          <w:i/>
+          <w:iCs/>
+          <w:color w:val="555555"/>
+          <w:sz w:val="19"/>
+          <w:szCs w:val="19"/>
+        </w:rPr>
+        <w:t xml:space="preserve">DNS security and content filtering platform for consumer, business and MSP customers</w:t>
+      </w:r>
+    </w:p>
+    <w:p>
+      <w:pPr>
+        <w:pStyle w:val="ListParagraph"/>
+        <w:numPr>
+          <w:ilvl w:val="0"/>
+          <w:numId w:val="2"/>
+        </w:numPr>
+        <w:spacing w:after="30"/>
+      </w:pPr>
+      <w:r>
+        <w:rPr>
+          <w:rFonts w:ascii="Calibri" w:cs="Calibri" w:eastAsia="Calibri" w:hAnsi="Calibri"/>
+          <w:sz w:val="20"/>
+          <w:szCs w:val="20"/>
+        </w:rPr>
+        <w:t xml:space="preserve">Led an accessibility overhaul of the customer dashboard, organization portal and marketing site, remediating 248 React components against an external WCAG 2.1 AA audit on a compliance deadline.</w:t>
+      </w:r>
+    </w:p>
+    <w:p>
+      <w:pPr>
+        <w:pStyle w:val="ListParagraph"/>
+        <w:numPr>
+          <w:ilvl w:val="0"/>
+          <w:numId w:val="2"/>
+        </w:numPr>
+        <w:spacing w:after="30"/>
+      </w:pPr>
+      <w:r>
+        <w:rPr>
+          <w:rFonts w:ascii="Calibri" w:cs="Calibri" w:eastAsia="Calibri" w:hAnsi="Calibri"/>
+          <w:sz w:val="20"/>
+          <w:szCs w:val="20"/>
+        </w:rPr>
+        <w:t xml:space="preserve">Built the cypress-axe suite that keeps it passing: WCAG 2.1 A/AA assertions across 96 routes, each run in desktop and mobile at both light and dark themes, with network calls stubbed so results stay deterministic.</w:t>
+      </w:r>
+    </w:p>
+    <w:p>
+      <w:pPr>
+        <w:pStyle w:val="ListParagraph"/>
+        <w:numPr>
+          <w:ilvl w:val="0"/>
+          <w:numId w:val="2"/>
+        </w:numPr>
+        <w:spacing w:after="30"/>
+      </w:pPr>
+      <w:r>
+        <w:rPr>
+          <w:rFonts w:ascii="Calibri" w:cs="Calibri" w:eastAsia="Calibri" w:hAnsi="Calibri"/>
+          <w:sz w:val="20"/>
+          <w:szCs w:val="20"/>
+        </w:rPr>
+        <w:t xml:space="preserve">Fixed focus management in the shared primitives instead of page by page. Modal and tray dialogs moved onto react-focus-lock, popups regained focus restoration, and colour contrast moved into the theme palette for both modes.</w:t>
+      </w:r>
+    </w:p>
+    <w:p>
+      <w:pPr>
+        <w:pStyle w:val="ListParagraph"/>
+        <w:numPr>
+          <w:ilvl w:val="0"/>
+          <w:numId w:val="2"/>
+        </w:numPr>
+        <w:spacing w:after="30"/>
+      </w:pPr>
+      <w:r>
+        <w:rPr>
+          <w:rFonts w:ascii="Calibri" w:cs="Calibri" w:eastAsia="Calibri" w:hAnsi="Calibri"/>
+          <w:sz w:val="20"/>
+          <w:szCs w:val="20"/>
+        </w:rPr>
+        <w:t xml:space="preserve">Added keyboard navigation to card, row and filter components that had been mouse-only.</w:t>
+      </w:r>
+    </w:p>
+    <w:p>
+      <w:pPr>
+        <w:pStyle w:val="ListParagraph"/>
+        <w:numPr>
+          <w:ilvl w:val="0"/>
+          <w:numId w:val="2"/>
+        </w:numPr>
+        <w:spacing w:after="30"/>
+      </w:pPr>
+      <w:r>
+        <w:rPr>
+          <w:rFonts w:ascii="Calibri" w:cs="Calibri" w:eastAsia="Calibri" w:hAnsi="Calibri"/>
+          <w:sz w:val="20"/>
+          <w:szCs w:val="20"/>
+        </w:rPr>
+        <w:t xml:space="preserve">Implemented SSO for four identity providers over 18 months, covering internal admins, customer organizations and personal users: Okta with group-to-role mapping, Google, Microsoft Entra ID with per-tenant OIDC discovery and PKCE, and Tailscale, all behind one entry point.</w:t>
+      </w:r>
+    </w:p>
+    <w:p>
+      <w:pPr>
+        <w:pStyle w:val="ListParagraph"/>
+        <w:numPr>
+          <w:ilvl w:val="0"/>
+          <w:numId w:val="2"/>
+        </w:numPr>
+        <w:spacing w:after="30"/>
+      </w:pPr>
+      <w:r>
+        <w:rPr>
+          <w:rFonts w:ascii="Calibri" w:cs="Calibri" w:eastAsia="Calibri" w:hAnsi="Calibri"/>
+          <w:sz w:val="20"/>
+          <w:szCs w:val="20"/>
+        </w:rPr>
+        <w:t xml:space="preserve">Owned the HubSpot integration in production for 18 months. A PHP client created contacts, companies, deals, invoices and line items, driven by Stripe webhooks for payment, subscription and payment-method events.</w:t>
+      </w:r>
+    </w:p>
+    <w:p>
+      <w:pPr>
+        <w:pStyle w:val="ListParagraph"/>
+        <w:numPr>
+          <w:ilvl w:val="0"/>
+          <w:numId w:val="2"/>
+        </w:numPr>
+        <w:spacing w:after="30"/>
+      </w:pPr>
+      <w:r>
+        <w:rPr>
+          <w:rFonts w:ascii="Calibri" w:cs="Calibri" w:eastAsia="Calibri" w:hAnsi="Calibri"/>
+          <w:sz w:val="20"/>
+          <w:szCs w:val="20"/>
+        </w:rPr>
+        <w:t xml:space="preserve">Built org-level scheduled reporting: React and RTK Query on the front, a PHP controller and cron behind it, branded PDFs out the other end.</w:t>
+      </w:r>
+    </w:p>
+    <w:p>
+      <w:pPr>
+        <w:keepNext/>
         <w:tabs>
           <w:tab w:val="right" w:pos="10368"/>
         </w:tabs>
@@ -301,7 +506,7 @@
           <w:sz w:val="20"/>
           <w:szCs w:val="20"/>
         </w:rPr>
-        <w:t xml:space="preserve">Senior Software Engineer, </w:t>
+        <w:t xml:space="preserve">Full Stack Developer, </w:t>
       </w:r>
       <w:r>
         <w:rPr>
@@ -312,7 +517,7 @@
           <w:sz w:val="20"/>
           <w:szCs w:val="20"/>
         </w:rPr>
-        <w:t xml:space="preserve">Control D (Windscribe)</w:t>
+        <w:t xml:space="preserve">Life House</w:t>
       </w:r>
       <w:r>
         <w:rPr>
@@ -321,15 +526,13 @@
           <w:sz w:val="19"/>
           <w:szCs w:val="19"/>
         </w:rPr>
-        <w:tab/>
-        <w:t xml:space="preserve">Mar 2024 - Apr 2026</w:t>
+        <w:t xml:space="preserve">	Oct 2022 - Feb 2024</w:t>
       </w:r>
     </w:p>
     <w:p>
       <w:pPr>
         <w:keepNext/>
-        <w:keepLines/>
-        <w:spacing w:after="70"/>
+        <w:spacing w:after="60"/>
       </w:pPr>
       <w:r>
         <w:rPr>
@@ -340,146 +543,120 @@
           <w:sz w:val="19"/>
           <w:szCs w:val="19"/>
         </w:rPr>
-        <w:t xml:space="preserve">DNS security and content filtering platform for consumer, business and MSP customers</w:t>
-      </w:r>
-    </w:p>
-    <w:p>
-      <w:pPr>
-        <w:pStyle w:val="ListParagraph"/>
-        <w:keepLines/>
-        <w:numPr>
-          <w:ilvl w:val="0"/>
-          <w:numId w:val="2"/>
-        </w:numPr>
-        <w:spacing w:after="45" w:line="240"/>
-      </w:pPr>
-      <w:r>
-        <w:rPr>
-          <w:rFonts w:ascii="Calibri" w:cs="Calibri" w:eastAsia="Calibri" w:hAnsi="Calibri"/>
-          <w:sz w:val="20"/>
-          <w:szCs w:val="20"/>
-        </w:rPr>
-        <w:t xml:space="preserve">Led an accessibility overhaul of the customer dashboard, organization portal and marketing site, remediating 248 React components against an external WCAG 2.1 AA audit on a compliance deadline.</w:t>
-      </w:r>
-    </w:p>
-    <w:p>
-      <w:pPr>
-        <w:pStyle w:val="ListParagraph"/>
-        <w:keepLines/>
-        <w:numPr>
-          <w:ilvl w:val="0"/>
-          <w:numId w:val="2"/>
-        </w:numPr>
-        <w:spacing w:after="45" w:line="240"/>
-      </w:pPr>
-      <w:r>
-        <w:rPr>
-          <w:rFonts w:ascii="Calibri" w:cs="Calibri" w:eastAsia="Calibri" w:hAnsi="Calibri"/>
-          <w:sz w:val="20"/>
-          <w:szCs w:val="20"/>
-        </w:rPr>
-        <w:t xml:space="preserve">Built the cypress-axe suite that keeps it passing: WCAG 2.1 A/AA assertions across 96 routes, each run in desktop and mobile at both light and dark themes, with network calls stubbed so results stay deterministic.</w:t>
-      </w:r>
-    </w:p>
-    <w:p>
-      <w:pPr>
-        <w:pStyle w:val="ListParagraph"/>
-        <w:keepLines/>
-        <w:numPr>
-          <w:ilvl w:val="0"/>
-          <w:numId w:val="2"/>
-        </w:numPr>
-        <w:spacing w:after="45" w:line="240"/>
-      </w:pPr>
-      <w:r>
-        <w:rPr>
-          <w:rFonts w:ascii="Calibri" w:cs="Calibri" w:eastAsia="Calibri" w:hAnsi="Calibri"/>
-          <w:sz w:val="20"/>
-          <w:szCs w:val="20"/>
-        </w:rPr>
-        <w:t xml:space="preserve">Fixed focus management in the shared primitives instead of page by page. Modal and tray dialogs moved onto react-focus-lock, popups regained focus restoration, and colour contrast moved into the theme palette for both modes.</w:t>
-      </w:r>
-    </w:p>
-    <w:p>
-      <w:pPr>
-        <w:pStyle w:val="ListParagraph"/>
-        <w:keepLines/>
-        <w:numPr>
-          <w:ilvl w:val="0"/>
-          <w:numId w:val="2"/>
-        </w:numPr>
-        <w:spacing w:after="45" w:line="240"/>
-      </w:pPr>
-      <w:r>
-        <w:rPr>
-          <w:rFonts w:ascii="Calibri" w:cs="Calibri" w:eastAsia="Calibri" w:hAnsi="Calibri"/>
-          <w:sz w:val="20"/>
-          <w:szCs w:val="20"/>
-        </w:rPr>
-        <w:t xml:space="preserve">Added keyboard navigation to card, row and filter components that had been mouse-only.</w:t>
-      </w:r>
-    </w:p>
-    <w:p>
-      <w:pPr>
-        <w:pStyle w:val="ListParagraph"/>
-        <w:keepLines/>
-        <w:numPr>
-          <w:ilvl w:val="0"/>
-          <w:numId w:val="2"/>
-        </w:numPr>
-        <w:spacing w:after="45" w:line="240"/>
-      </w:pPr>
-      <w:r>
-        <w:rPr>
-          <w:rFonts w:ascii="Calibri" w:cs="Calibri" w:eastAsia="Calibri" w:hAnsi="Calibri"/>
-          <w:sz w:val="20"/>
-          <w:szCs w:val="20"/>
-        </w:rPr>
-        <w:t xml:space="preserve">Sole engineer on the PHP REST API, implementing SSO for four identity providers over 18 months, covering internal admins, customer organizations and personal users: Okta with group-to-role mapping, Google, Microsoft Entra ID with per-tenant OIDC discovery and PKCE, and Tailscale, all behind one entry point.</w:t>
-      </w:r>
-    </w:p>
-    <w:p>
-      <w:pPr>
-        <w:pStyle w:val="ListParagraph"/>
-        <w:keepLines/>
-        <w:numPr>
-          <w:ilvl w:val="0"/>
-          <w:numId w:val="2"/>
-        </w:numPr>
-        <w:spacing w:after="45" w:line="240"/>
-      </w:pPr>
-      <w:r>
-        <w:rPr>
-          <w:rFonts w:ascii="Calibri" w:cs="Calibri" w:eastAsia="Calibri" w:hAnsi="Calibri"/>
-          <w:sz w:val="20"/>
-          <w:szCs w:val="20"/>
-        </w:rPr>
-        <w:t xml:space="preserve">Owned the HubSpot integration in production for 18 months. A PHP client created contacts, companies, deals, invoices and line items, driven by Stripe webhooks for payment, subscription and payment-method events.</w:t>
-      </w:r>
-    </w:p>
-    <w:p>
-      <w:pPr>
-        <w:pStyle w:val="ListParagraph"/>
-        <w:keepLines/>
-        <w:numPr>
-          <w:ilvl w:val="0"/>
-          <w:numId w:val="2"/>
-        </w:numPr>
-        <w:spacing w:after="45" w:line="240"/>
-      </w:pPr>
-      <w:r>
-        <w:rPr>
-          <w:rFonts w:ascii="Calibri" w:cs="Calibri" w:eastAsia="Calibri" w:hAnsi="Calibri"/>
-          <w:sz w:val="20"/>
-          <w:szCs w:val="20"/>
-        </w:rPr>
-        <w:t xml:space="preserve">Built org-level scheduled reporting: React and RTK Query on the front, a PHP controller and cron behind it, branded PDFs out the other end.</w:t>
+        <w:t xml:space="preserve">Revenue management SaaS for independent hotels</w:t>
+      </w:r>
+    </w:p>
+    <w:p>
+      <w:pPr>
+        <w:pStyle w:val="ListParagraph"/>
+        <w:numPr>
+          <w:ilvl w:val="0"/>
+          <w:numId w:val="2"/>
+        </w:numPr>
+        <w:spacing w:after="30"/>
+      </w:pPr>
+      <w:r>
+        <w:rPr>
+          <w:rFonts w:ascii="Calibri" w:cs="Calibri" w:eastAsia="Calibri" w:hAnsi="Calibri"/>
+          <w:sz w:val="20"/>
+          <w:szCs w:val="20"/>
+        </w:rPr>
+        <w:t xml:space="preserve">Primary frontend engineer on the guest-facing booking widget, an embeddable React and TypeScript booking flow hotels dropped onto their own sites with one script tag.</w:t>
+      </w:r>
+    </w:p>
+    <w:p>
+      <w:pPr>
+        <w:pStyle w:val="ListParagraph"/>
+        <w:numPr>
+          <w:ilvl w:val="0"/>
+          <w:numId w:val="2"/>
+        </w:numPr>
+        <w:spacing w:after="30"/>
+      </w:pPr>
+      <w:r>
+        <w:rPr>
+          <w:rFonts w:ascii="Calibri" w:cs="Calibri" w:eastAsia="Calibri" w:hAnsi="Calibri"/>
+          <w:sz w:val="20"/>
+          <w:szCs w:val="20"/>
+        </w:rPr>
+        <w:t xml:space="preserve">Scoped every generated CSS rule to the widget container with a custom Emotion stylis plugin, avoiding both Shadow DOM and an iframe. Wrote the html-tag and keyframe exclusions that global and animation rules needed to survive it.</w:t>
+      </w:r>
+    </w:p>
+    <w:p>
+      <w:pPr>
+        <w:pStyle w:val="ListParagraph"/>
+        <w:numPr>
+          <w:ilvl w:val="0"/>
+          <w:numId w:val="2"/>
+        </w:numPr>
+        <w:spacing w:after="30"/>
+      </w:pPr>
+      <w:r>
+        <w:rPr>
+          <w:rFonts w:ascii="Calibri" w:cs="Calibri" w:eastAsia="Calibri" w:hAnsi="Calibri"/>
+          <w:sz w:val="20"/>
+          <w:szCs w:val="20"/>
+        </w:rPr>
+        <w:t xml:space="preserve">Retrofitted five languages and multi-currency support onto a UI that had already shipped: 88 files, 22 i18next namespaces, served from Contentful over GraphQL.</w:t>
+      </w:r>
+    </w:p>
+    <w:p>
+      <w:pPr>
+        <w:pStyle w:val="ListParagraph"/>
+        <w:numPr>
+          <w:ilvl w:val="0"/>
+          <w:numId w:val="2"/>
+        </w:numPr>
+        <w:spacing w:after="30"/>
+      </w:pPr>
+      <w:r>
+        <w:rPr>
+          <w:rFonts w:ascii="Calibri" w:cs="Calibri" w:eastAsia="Calibri" w:hAnsi="Calibri"/>
+          <w:sz w:val="20"/>
+          <w:szCs w:val="20"/>
+        </w:rPr>
+        <w:t xml:space="preserve">Built bulk rate editing for hotel operators. Date-range and weekday filters apply price overrides in one mutation, and the override editor derives per-night and percentage inputs from each other.</w:t>
+      </w:r>
+    </w:p>
+    <w:p>
+      <w:pPr>
+        <w:pStyle w:val="ListParagraph"/>
+        <w:numPr>
+          <w:ilvl w:val="0"/>
+          <w:numId w:val="2"/>
+        </w:numPr>
+        <w:spacing w:after="30"/>
+      </w:pPr>
+      <w:r>
+        <w:rPr>
+          <w:rFonts w:ascii="Calibri" w:cs="Calibri" w:eastAsia="Calibri" w:hAnsi="Calibri"/>
+          <w:sz w:val="20"/>
+          <w:szCs w:val="20"/>
+        </w:rPr>
+        <w:t xml:space="preserve">Top contributor on the revenue and marketing dashboards, covering occupancy, ADR, RevPAR, competitor rates and booking pace over an Apollo Federation GraphQL gateway.</w:t>
+      </w:r>
+    </w:p>
+    <w:p>
+      <w:pPr>
+        <w:pStyle w:val="ListParagraph"/>
+        <w:numPr>
+          <w:ilvl w:val="0"/>
+          <w:numId w:val="2"/>
+        </w:numPr>
+        <w:spacing w:after="30"/>
+      </w:pPr>
+      <w:r>
+        <w:rPr>
+          <w:rFonts w:ascii="Calibri" w:cs="Calibri" w:eastAsia="Calibri" w:hAnsi="Calibri"/>
+          <w:sz w:val="20"/>
+          <w:szCs w:val="20"/>
+        </w:rPr>
+        <w:t xml:space="preserve">Contributed to a published Radix design system shared by the admin and guest apps, and built a NestJS GraphQL subgraph over the Mews and Cloudbeds PMS APIs.</w:t>
       </w:r>
     </w:p>
     <w:p>
       <w:pPr>
         <w:keepNext/>
-        <w:keepLines/>
         <w:tabs>
           <w:tab w:val="right" w:pos="10368"/>
         </w:tabs>
@@ -493,7 +670,7 @@
           <w:sz w:val="20"/>
           <w:szCs w:val="20"/>
         </w:rPr>
-        <w:t xml:space="preserve">Full Stack Developer, </w:t>
+        <w:t xml:space="preserve">Frontend Engineer, </w:t>
       </w:r>
       <w:r>
         <w:rPr>
@@ -504,7 +681,7 @@
           <w:sz w:val="20"/>
           <w:szCs w:val="20"/>
         </w:rPr>
-        <w:t xml:space="preserve">Life House</w:t>
+        <w:t xml:space="preserve">Studio</w:t>
       </w:r>
       <w:r>
         <w:rPr>
@@ -513,15 +690,13 @@
           <w:sz w:val="19"/>
           <w:szCs w:val="19"/>
         </w:rPr>
-        <w:tab/>
-        <w:t xml:space="preserve">Oct 2022 - Feb 2024</w:t>
+        <w:t xml:space="preserve">	Mar 2022 - Aug 2022</w:t>
       </w:r>
     </w:p>
     <w:p>
       <w:pPr>
         <w:keepNext/>
-        <w:keepLines/>
-        <w:spacing w:after="70"/>
+        <w:spacing w:after="60"/>
       </w:pPr>
       <w:r>
         <w:rPr>
@@ -532,127 +707,84 @@
           <w:sz w:val="19"/>
           <w:szCs w:val="19"/>
         </w:rPr>
-        <w:t xml:space="preserve">Revenue management SaaS for independent hotels</w:t>
-      </w:r>
-    </w:p>
-    <w:p>
-      <w:pPr>
-        <w:pStyle w:val="ListParagraph"/>
-        <w:keepLines/>
-        <w:numPr>
-          <w:ilvl w:val="0"/>
-          <w:numId w:val="2"/>
-        </w:numPr>
-        <w:spacing w:after="45" w:line="240"/>
-      </w:pPr>
-      <w:r>
-        <w:rPr>
-          <w:rFonts w:ascii="Calibri" w:cs="Calibri" w:eastAsia="Calibri" w:hAnsi="Calibri"/>
-          <w:sz w:val="20"/>
-          <w:szCs w:val="20"/>
-        </w:rPr>
-        <w:t xml:space="preserve">Primary frontend engineer on the guest-facing booking widget, an embeddable React and TypeScript booking flow hotels dropped onto their own sites with one script tag.</w:t>
-      </w:r>
-    </w:p>
-    <w:p>
-      <w:pPr>
-        <w:pStyle w:val="ListParagraph"/>
-        <w:keepLines/>
-        <w:numPr>
-          <w:ilvl w:val="0"/>
-          <w:numId w:val="2"/>
-        </w:numPr>
-        <w:spacing w:after="45" w:line="240"/>
-      </w:pPr>
-      <w:r>
-        <w:rPr>
-          <w:rFonts w:ascii="Calibri" w:cs="Calibri" w:eastAsia="Calibri" w:hAnsi="Calibri"/>
-          <w:sz w:val="20"/>
-          <w:szCs w:val="20"/>
-        </w:rPr>
-        <w:t xml:space="preserve">Scoped every generated CSS rule to the widget container with a custom Emotion stylis plugin, avoiding both Shadow DOM and an iframe. Wrote the html-tag and keyframe exclusions that global and animation rules needed to survive it.</w:t>
-      </w:r>
-    </w:p>
-    <w:p>
-      <w:pPr>
-        <w:pStyle w:val="ListParagraph"/>
-        <w:keepLines/>
-        <w:numPr>
-          <w:ilvl w:val="0"/>
-          <w:numId w:val="2"/>
-        </w:numPr>
-        <w:spacing w:after="45" w:line="240"/>
-      </w:pPr>
-      <w:r>
-        <w:rPr>
-          <w:rFonts w:ascii="Calibri" w:cs="Calibri" w:eastAsia="Calibri" w:hAnsi="Calibri"/>
-          <w:sz w:val="20"/>
-          <w:szCs w:val="20"/>
-        </w:rPr>
-        <w:t xml:space="preserve">Retrofitted five languages and multi-currency support onto a UI that had already shipped: 88 files, 22 i18next namespaces, served from Contentful over GraphQL.</w:t>
-      </w:r>
-    </w:p>
-    <w:p>
-      <w:pPr>
-        <w:pStyle w:val="ListParagraph"/>
-        <w:keepLines/>
-        <w:numPr>
-          <w:ilvl w:val="0"/>
-          <w:numId w:val="2"/>
-        </w:numPr>
-        <w:spacing w:after="45" w:line="240"/>
-      </w:pPr>
-      <w:r>
-        <w:rPr>
-          <w:rFonts w:ascii="Calibri" w:cs="Calibri" w:eastAsia="Calibri" w:hAnsi="Calibri"/>
-          <w:sz w:val="20"/>
-          <w:szCs w:val="20"/>
-        </w:rPr>
-        <w:t xml:space="preserve">Built bulk rate editing for hotel operators. Date-range and weekday filters apply price overrides in one mutation, and the override editor derives per-night and percentage inputs from each other.</w:t>
-      </w:r>
-    </w:p>
-    <w:p>
-      <w:pPr>
-        <w:pStyle w:val="ListParagraph"/>
-        <w:keepLines/>
-        <w:numPr>
-          <w:ilvl w:val="0"/>
-          <w:numId w:val="2"/>
-        </w:numPr>
-        <w:spacing w:after="45" w:line="240"/>
-      </w:pPr>
-      <w:r>
-        <w:rPr>
-          <w:rFonts w:ascii="Calibri" w:cs="Calibri" w:eastAsia="Calibri" w:hAnsi="Calibri"/>
-          <w:sz w:val="20"/>
-          <w:szCs w:val="20"/>
-        </w:rPr>
-        <w:t xml:space="preserve">Top contributor on the revenue and marketing dashboards, covering occupancy, ADR, RevPAR, competitor rates and booking pace over an Apollo Federation GraphQL gateway.</w:t>
-      </w:r>
-    </w:p>
-    <w:p>
-      <w:pPr>
-        <w:pStyle w:val="ListParagraph"/>
-        <w:keepLines/>
-        <w:numPr>
-          <w:ilvl w:val="0"/>
-          <w:numId w:val="2"/>
-        </w:numPr>
-        <w:spacing w:after="45" w:line="240"/>
-      </w:pPr>
-      <w:r>
-        <w:rPr>
-          <w:rFonts w:ascii="Calibri" w:cs="Calibri" w:eastAsia="Calibri" w:hAnsi="Calibri"/>
-          <w:sz w:val="20"/>
-          <w:szCs w:val="20"/>
-        </w:rPr>
-        <w:t xml:space="preserve">Contributed to a published Radix design system shared by the admin and guest apps, and built a NestJS GraphQL subgraph over the Mews and Cloudbeds PMS APIs.</w:t>
+        <w:t xml:space="preserve">Brand and digital design agency</w:t>
+      </w:r>
+    </w:p>
+    <w:p>
+      <w:pPr>
+        <w:pStyle w:val="ListParagraph"/>
+        <w:numPr>
+          <w:ilvl w:val="0"/>
+          <w:numId w:val="2"/>
+        </w:numPr>
+        <w:spacing w:after="30"/>
+      </w:pPr>
+      <w:r>
+        <w:rPr>
+          <w:rFonts w:ascii="Calibri" w:cs="Calibri" w:eastAsia="Calibri" w:hAnsi="Calibri"/>
+          <w:sz w:val="20"/>
+          <w:szCs w:val="20"/>
+        </w:rPr>
+        <w:t xml:space="preserve">Sole developer on the agency’s marketing site after picking up a stalled prototype. Rebuilt the landing page, navigation and case-study system over roughly 170 pull requests, writing about 70% of the shipped source.</w:t>
+      </w:r>
+    </w:p>
+    <w:p>
+      <w:pPr>
+        <w:pStyle w:val="ListParagraph"/>
+        <w:numPr>
+          <w:ilvl w:val="0"/>
+          <w:numId w:val="2"/>
+        </w:numPr>
+        <w:spacing w:after="30"/>
+      </w:pPr>
+      <w:r>
+        <w:rPr>
+          <w:rFonts w:ascii="Calibri" w:cs="Calibri" w:eastAsia="Calibri" w:hAnsi="Calibri"/>
+          <w:sz w:val="20"/>
+          <w:szCs w:val="20"/>
+        </w:rPr>
+        <w:t xml:space="preserve">Built the scroll engine driving the site: four coordinated GSAP ScrollTriggers per section for active state, page-chrome theming, paint gating on offscreen content and pinned stacked-section reveals, with offsets resolved per section and per breakpoint and full teardown on resize.</w:t>
+      </w:r>
+    </w:p>
+    <w:p>
+      <w:pPr>
+        <w:pStyle w:val="ListParagraph"/>
+        <w:numPr>
+          <w:ilvl w:val="0"/>
+          <w:numId w:val="2"/>
+        </w:numPr>
+        <w:spacing w:after="30"/>
+      </w:pPr>
+      <w:r>
+        <w:rPr>
+          <w:rFonts w:ascii="Calibri" w:cs="Calibri" w:eastAsia="Calibri" w:hAnsi="Calibri"/>
+          <w:sz w:val="20"/>
+          <w:szCs w:val="20"/>
+        </w:rPr>
+        <w:t xml:space="preserve">Rendered route transitions on canvas. GSAP timelines paint staggered DPR-scaled ripples out from the click point, and navigation fires from the animation’s completion callback.</w:t>
+      </w:r>
+    </w:p>
+    <w:p>
+      <w:pPr>
+        <w:pStyle w:val="ListParagraph"/>
+        <w:numPr>
+          <w:ilvl w:val="0"/>
+          <w:numId w:val="2"/>
+        </w:numPr>
+        <w:spacing w:after="30"/>
+      </w:pPr>
+      <w:r>
+        <w:rPr>
+          <w:rFonts w:ascii="Calibri" w:cs="Calibri" w:eastAsia="Calibri" w:hAnsi="Calibri"/>
+          <w:sz w:val="20"/>
+          <w:szCs w:val="20"/>
+        </w:rPr>
+        <w:t xml:space="preserve">Wrote the deploy pipeline: three GitHub Actions workflows to Firebase Hosting production and dev, plus an ephemeral preview channel per pull request.</w:t>
       </w:r>
     </w:p>
     <w:p>
       <w:pPr>
         <w:keepNext/>
-        <w:keepLines/>
         <w:tabs>
           <w:tab w:val="right" w:pos="10368"/>
         </w:tabs>
@@ -666,7 +798,7 @@
           <w:sz w:val="20"/>
           <w:szCs w:val="20"/>
         </w:rPr>
-        <w:t xml:space="preserve">Frontend Engineer, </w:t>
+        <w:t xml:space="preserve">Full Stack Web Developer, </w:t>
       </w:r>
       <w:r>
         <w:rPr>
@@ -677,7 +809,7 @@
           <w:sz w:val="20"/>
           <w:szCs w:val="20"/>
         </w:rPr>
-        <w:t xml:space="preserve">Studio</w:t>
+        <w:t xml:space="preserve">Brandish Agency</w:t>
       </w:r>
       <w:r>
         <w:rPr>
@@ -686,15 +818,13 @@
           <w:sz w:val="19"/>
           <w:szCs w:val="19"/>
         </w:rPr>
-        <w:tab/>
-        <w:t xml:space="preserve">Mar 2022 - Aug 2022</w:t>
+        <w:t xml:space="preserve">	Mar 2020 - Mar 2022</w:t>
       </w:r>
     </w:p>
     <w:p>
       <w:pPr>
         <w:keepNext/>
-        <w:keepLines/>
-        <w:spacing w:after="70"/>
+        <w:spacing w:after="60"/>
       </w:pPr>
       <w:r>
         <w:rPr>
@@ -705,89 +835,102 @@
           <w:sz w:val="19"/>
           <w:szCs w:val="19"/>
         </w:rPr>
-        <w:t xml:space="preserve">Brand and digital design agency</w:t>
-      </w:r>
-    </w:p>
-    <w:p>
-      <w:pPr>
-        <w:pStyle w:val="ListParagraph"/>
-        <w:keepLines/>
-        <w:numPr>
-          <w:ilvl w:val="0"/>
-          <w:numId w:val="2"/>
-        </w:numPr>
-        <w:spacing w:after="45" w:line="240"/>
-      </w:pPr>
-      <w:r>
-        <w:rPr>
-          <w:rFonts w:ascii="Calibri" w:cs="Calibri" w:eastAsia="Calibri" w:hAnsi="Calibri"/>
-          <w:sz w:val="20"/>
-          <w:szCs w:val="20"/>
-        </w:rPr>
-        <w:t xml:space="preserve">Sole developer after taking over a stalled prototype of the agency’s marketing site. Rebuilt the landing page, navigation and case-study system over roughly 170 pull requests, writing about 70% of the shipped source.</w:t>
-      </w:r>
-    </w:p>
-    <w:p>
-      <w:pPr>
-        <w:pStyle w:val="ListParagraph"/>
-        <w:keepLines/>
-        <w:numPr>
-          <w:ilvl w:val="0"/>
-          <w:numId w:val="2"/>
-        </w:numPr>
-        <w:spacing w:after="45" w:line="240"/>
-      </w:pPr>
-      <w:r>
-        <w:rPr>
-          <w:rFonts w:ascii="Calibri" w:cs="Calibri" w:eastAsia="Calibri" w:hAnsi="Calibri"/>
-          <w:sz w:val="20"/>
-          <w:szCs w:val="20"/>
-        </w:rPr>
-        <w:t xml:space="preserve">Built the scroll engine driving the site: four coordinated GSAP ScrollTriggers per section for active state, page-chrome theming, paint gating on offscreen content and pinned stacked-section reveals, with offsets resolved per section and per breakpoint and full teardown on resize.</w:t>
-      </w:r>
-    </w:p>
-    <w:p>
-      <w:pPr>
-        <w:pStyle w:val="ListParagraph"/>
-        <w:keepLines/>
-        <w:numPr>
-          <w:ilvl w:val="0"/>
-          <w:numId w:val="2"/>
-        </w:numPr>
-        <w:spacing w:after="45" w:line="240"/>
-      </w:pPr>
-      <w:r>
-        <w:rPr>
-          <w:rFonts w:ascii="Calibri" w:cs="Calibri" w:eastAsia="Calibri" w:hAnsi="Calibri"/>
-          <w:sz w:val="20"/>
-          <w:szCs w:val="20"/>
-        </w:rPr>
-        <w:t xml:space="preserve">Rendered route transitions on canvas. GSAP timelines paint staggered DPR-scaled ripples out from the click point, and navigation fires from the animation’s completion callback.</w:t>
-      </w:r>
-    </w:p>
-    <w:p>
-      <w:pPr>
-        <w:pStyle w:val="ListParagraph"/>
-        <w:keepLines/>
-        <w:numPr>
-          <w:ilvl w:val="0"/>
-          <w:numId w:val="2"/>
-        </w:numPr>
-        <w:spacing w:after="45" w:line="240"/>
-      </w:pPr>
-      <w:r>
-        <w:rPr>
-          <w:rFonts w:ascii="Calibri" w:cs="Calibri" w:eastAsia="Calibri" w:hAnsi="Calibri"/>
-          <w:sz w:val="20"/>
-          <w:szCs w:val="20"/>
-        </w:rPr>
-        <w:t xml:space="preserve">Wrote the deploy pipeline: three GitHub Actions workflows to Firebase Hosting production and dev, plus an ephemeral preview channel per pull request.</w:t>
+        <w:t xml:space="preserve">Digital agency; WordPress, headless and custom client builds</w:t>
+      </w:r>
+    </w:p>
+    <w:p>
+      <w:pPr>
+        <w:pStyle w:val="ListParagraph"/>
+        <w:numPr>
+          <w:ilvl w:val="0"/>
+          <w:numId w:val="2"/>
+        </w:numPr>
+        <w:spacing w:after="30"/>
+      </w:pPr>
+      <w:r>
+        <w:rPr>
+          <w:rFonts w:ascii="Calibri" w:cs="Calibri" w:eastAsia="Calibri" w:hAnsi="Calibri"/>
+          <w:sz w:val="20"/>
+          <w:szCs w:val="20"/>
+        </w:rPr>
+        <w:t xml:space="preserve">Led development on the agency’s main client accounts. Majority author on six of nine repositories, sole author on four, and primary merge integrator on every multi-developer project.</w:t>
+      </w:r>
+    </w:p>
+    <w:p>
+      <w:pPr>
+        <w:pStyle w:val="ListParagraph"/>
+        <w:numPr>
+          <w:ilvl w:val="0"/>
+          <w:numId w:val="2"/>
+        </w:numPr>
+        <w:spacing w:after="30"/>
+      </w:pPr>
+      <w:r>
+        <w:rPr>
+          <w:rFonts w:ascii="Calibri" w:cs="Calibri" w:eastAsia="Calibri" w:hAnsi="Calibri"/>
+          <w:sz w:val="20"/>
+          <w:szCs w:val="20"/>
+        </w:rPr>
+        <w:t xml:space="preserve">Built a college website on a Timber/Twig WordPress theme with 8 custom post types and 67 ACF field groups, including an embedded React SPA program catalogue with Context API, custom hooks, react-query and React Testing Library coverage.</w:t>
+      </w:r>
+    </w:p>
+    <w:p>
+      <w:pPr>
+        <w:pStyle w:val="ListParagraph"/>
+        <w:numPr>
+          <w:ilvl w:val="0"/>
+          <w:numId w:val="2"/>
+        </w:numPr>
+        <w:spacing w:after="30"/>
+      </w:pPr>
+      <w:r>
+        <w:rPr>
+          <w:rFonts w:ascii="Calibri" w:cs="Calibri" w:eastAsia="Calibri" w:hAnsi="Calibri"/>
+          <w:sz w:val="20"/>
+          <w:szCs w:val="20"/>
+        </w:rPr>
+        <w:t xml:space="preserve">Built the agency’s own site headless: a Gatsby front end sourcing WordPress over WPGraphQL, on Netlify, with a serverless function handling forms.</w:t>
+      </w:r>
+    </w:p>
+    <w:p>
+      <w:pPr>
+        <w:pStyle w:val="ListParagraph"/>
+        <w:numPr>
+          <w:ilvl w:val="0"/>
+          <w:numId w:val="2"/>
+        </w:numPr>
+        <w:spacing w:after="30"/>
+      </w:pPr>
+      <w:r>
+        <w:rPr>
+          <w:rFonts w:ascii="Calibri" w:cs="Calibri" w:eastAsia="Calibri" w:hAnsi="Calibri"/>
+          <w:sz w:val="20"/>
+          <w:szCs w:val="20"/>
+        </w:rPr>
+        <w:t xml:space="preserve">Wrote the CI pipeline for the largest client project. Builds fire only when source actually changes, with three-tier dependency caching, a two-stage React-then-theme build and deploy webhooks across four environments.</w:t>
+      </w:r>
+    </w:p>
+    <w:p>
+      <w:pPr>
+        <w:pStyle w:val="ListParagraph"/>
+        <w:numPr>
+          <w:ilvl w:val="0"/>
+          <w:numId w:val="2"/>
+        </w:numPr>
+        <w:spacing w:after="30"/>
+      </w:pPr>
+      <w:r>
+        <w:rPr>
+          <w:rFonts w:ascii="Calibri" w:cs="Calibri" w:eastAsia="Calibri" w:hAnsi="Calibri"/>
+          <w:sz w:val="20"/>
+          <w:szCs w:val="20"/>
+        </w:rPr>
+        <w:t xml:space="preserve">Standardized a reusable theme build scaffold and a shared Elementor widget plugin across client projects. Mentored a junior developer.</w:t>
       </w:r>
     </w:p>
     <w:p>
       <w:pPr>
         <w:keepNext/>
-        <w:keepLines/>
         <w:tabs>
           <w:tab w:val="right" w:pos="10368"/>
         </w:tabs>
@@ -801,7 +944,7 @@
           <w:sz w:val="20"/>
           <w:szCs w:val="20"/>
         </w:rPr>
-        <w:t xml:space="preserve">Full Stack Web Developer, </w:t>
+        <w:t xml:space="preserve">Full Stack Developer, </w:t>
       </w:r>
       <w:r>
         <w:rPr>
@@ -812,7 +955,7 @@
           <w:sz w:val="20"/>
           <w:szCs w:val="20"/>
         </w:rPr>
-        <w:t xml:space="preserve">Brandish Agency</w:t>
+        <w:t xml:space="preserve">Elite Digital Agency</w:t>
       </w:r>
       <w:r>
         <w:rPr>
@@ -821,15 +964,13 @@
           <w:sz w:val="19"/>
           <w:szCs w:val="19"/>
         </w:rPr>
-        <w:tab/>
-        <w:t xml:space="preserve">Mar 2020 - Mar 2022</w:t>
+        <w:t xml:space="preserve">	May 2018 - Mar 2020</w:t>
       </w:r>
     </w:p>
     <w:p>
       <w:pPr>
         <w:keepNext/>
-        <w:keepLines/>
-        <w:spacing w:after="70"/>
+        <w:spacing w:after="60"/>
       </w:pPr>
       <w:r>
         <w:rPr>
@@ -840,172 +981,17 @@
           <w:sz w:val="19"/>
           <w:szCs w:val="19"/>
         </w:rPr>
-        <w:t xml:space="preserve">Digital agency; WordPress, headless and custom client builds</w:t>
-      </w:r>
-    </w:p>
-    <w:p>
-      <w:pPr>
-        <w:pStyle w:val="ListParagraph"/>
-        <w:keepLines/>
-        <w:numPr>
-          <w:ilvl w:val="0"/>
-          <w:numId w:val="2"/>
-        </w:numPr>
-        <w:spacing w:after="45" w:line="240"/>
-      </w:pPr>
-      <w:r>
-        <w:rPr>
-          <w:rFonts w:ascii="Calibri" w:cs="Calibri" w:eastAsia="Calibri" w:hAnsi="Calibri"/>
-          <w:sz w:val="20"/>
-          <w:szCs w:val="20"/>
-        </w:rPr>
-        <w:t xml:space="preserve">Led development on the agency’s main client accounts. Majority author on six of nine repositories, sole author on four, and primary merge integrator on every multi-developer project.</w:t>
-      </w:r>
-    </w:p>
-    <w:p>
-      <w:pPr>
-        <w:pStyle w:val="ListParagraph"/>
-        <w:keepLines/>
-        <w:numPr>
-          <w:ilvl w:val="0"/>
-          <w:numId w:val="2"/>
-        </w:numPr>
-        <w:spacing w:after="45" w:line="240"/>
-      </w:pPr>
-      <w:r>
-        <w:rPr>
-          <w:rFonts w:ascii="Calibri" w:cs="Calibri" w:eastAsia="Calibri" w:hAnsi="Calibri"/>
-          <w:sz w:val="20"/>
-          <w:szCs w:val="20"/>
-        </w:rPr>
-        <w:t xml:space="preserve">Built a college website on a Timber/Twig WordPress theme with 8 custom post types and 67 ACF field groups, including an embedded React SPA program catalogue with Context API, custom hooks, react-query and React Testing Library coverage.</w:t>
-      </w:r>
-    </w:p>
-    <w:p>
-      <w:pPr>
-        <w:pStyle w:val="ListParagraph"/>
-        <w:keepLines/>
-        <w:numPr>
-          <w:ilvl w:val="0"/>
-          <w:numId w:val="2"/>
-        </w:numPr>
-        <w:spacing w:after="45" w:line="240"/>
-      </w:pPr>
-      <w:r>
-        <w:rPr>
-          <w:rFonts w:ascii="Calibri" w:cs="Calibri" w:eastAsia="Calibri" w:hAnsi="Calibri"/>
-          <w:sz w:val="20"/>
-          <w:szCs w:val="20"/>
-        </w:rPr>
-        <w:t xml:space="preserve">Built the agency’s own site headless: a Gatsby front end sourcing WordPress over WPGraphQL, on Netlify, with a serverless function handling forms.</w:t>
-      </w:r>
-    </w:p>
-    <w:p>
-      <w:pPr>
-        <w:pStyle w:val="ListParagraph"/>
-        <w:keepLines/>
-        <w:numPr>
-          <w:ilvl w:val="0"/>
-          <w:numId w:val="2"/>
-        </w:numPr>
-        <w:spacing w:after="45" w:line="240"/>
-      </w:pPr>
-      <w:r>
-        <w:rPr>
-          <w:rFonts w:ascii="Calibri" w:cs="Calibri" w:eastAsia="Calibri" w:hAnsi="Calibri"/>
-          <w:sz w:val="20"/>
-          <w:szCs w:val="20"/>
-        </w:rPr>
-        <w:t xml:space="preserve">Wrote the CI pipeline for the largest client project. Builds fire only when source actually changes, with three-tier dependency caching, a two-stage React-then-theme build and deploy webhooks across four environments.</w:t>
-      </w:r>
-    </w:p>
-    <w:p>
-      <w:pPr>
-        <w:pStyle w:val="ListParagraph"/>
-        <w:keepLines/>
-        <w:numPr>
-          <w:ilvl w:val="0"/>
-          <w:numId w:val="2"/>
-        </w:numPr>
-        <w:spacing w:after="45" w:line="240"/>
-      </w:pPr>
-      <w:r>
-        <w:rPr>
-          <w:rFonts w:ascii="Calibri" w:cs="Calibri" w:eastAsia="Calibri" w:hAnsi="Calibri"/>
-          <w:sz w:val="20"/>
-          <w:szCs w:val="20"/>
-        </w:rPr>
-        <w:t xml:space="preserve">Standardized a reusable theme build scaffold and a shared Elementor widget plugin across client projects. Mentored a junior developer.</w:t>
-      </w:r>
-    </w:p>
-    <w:p>
-      <w:pPr>
-        <w:keepNext/>
-        <w:keepLines/>
-        <w:tabs>
-          <w:tab w:val="right" w:pos="10368"/>
-        </w:tabs>
-        <w:spacing w:after="0" w:before="150"/>
-      </w:pPr>
-      <w:r>
-        <w:rPr>
-          <w:rFonts w:ascii="Calibri" w:cs="Calibri" w:eastAsia="Calibri" w:hAnsi="Calibri"/>
-          <w:b/>
-          <w:bCs/>
-          <w:sz w:val="20"/>
-          <w:szCs w:val="20"/>
-        </w:rPr>
-        <w:t xml:space="preserve">Full Stack Developer, </w:t>
-      </w:r>
-      <w:r>
-        <w:rPr>
-          <w:rFonts w:ascii="Calibri" w:cs="Calibri" w:eastAsia="Calibri" w:hAnsi="Calibri"/>
-          <w:b/>
-          <w:bCs/>
-          <w:color w:val="1B4F9C"/>
-          <w:sz w:val="20"/>
-          <w:szCs w:val="20"/>
-        </w:rPr>
-        <w:t xml:space="preserve">Elite Digital Agency</w:t>
-      </w:r>
-      <w:r>
-        <w:rPr>
-          <w:rFonts w:ascii="Calibri" w:cs="Calibri" w:eastAsia="Calibri" w:hAnsi="Calibri"/>
-          <w:color w:val="555555"/>
-          <w:sz w:val="19"/>
-          <w:szCs w:val="19"/>
-        </w:rPr>
-        <w:tab/>
-        <w:t xml:space="preserve">May 2018 - Mar 2020</w:t>
-      </w:r>
-    </w:p>
-    <w:p>
-      <w:pPr>
-        <w:keepNext/>
-        <w:keepLines/>
-        <w:spacing w:after="70"/>
-      </w:pPr>
-      <w:r>
-        <w:rPr>
-          <w:rFonts w:ascii="Calibri" w:cs="Calibri" w:eastAsia="Calibri" w:hAnsi="Calibri"/>
-          <w:i/>
-          <w:iCs/>
-          <w:color w:val="555555"/>
-          <w:sz w:val="19"/>
-          <w:szCs w:val="19"/>
-        </w:rPr>
         <w:t xml:space="preserve">Digital agency; enterprise applications and client web builds</w:t>
       </w:r>
     </w:p>
     <w:p>
       <w:pPr>
         <w:pStyle w:val="ListParagraph"/>
-        <w:keepLines/>
-        <w:numPr>
-          <w:ilvl w:val="0"/>
-          <w:numId w:val="2"/>
-        </w:numPr>
-        <w:spacing w:after="45" w:line="240"/>
+        <w:numPr>
+          <w:ilvl w:val="0"/>
+          <w:numId w:val="2"/>
+        </w:numPr>
+        <w:spacing w:after="30"/>
       </w:pPr>
       <w:r>
         <w:rPr>
@@ -1019,12 +1005,11 @@
     <w:p>
       <w:pPr>
         <w:pStyle w:val="ListParagraph"/>
-        <w:keepLines/>
-        <w:numPr>
-          <w:ilvl w:val="0"/>
-          <w:numId w:val="2"/>
-        </w:numPr>
-        <w:spacing w:after="45" w:line="240"/>
+        <w:numPr>
+          <w:ilvl w:val="0"/>
+          <w:numId w:val="2"/>
+        </w:numPr>
+        <w:spacing w:after="30"/>
       </w:pPr>
       <w:r>
         <w:rPr>
@@ -1038,12 +1023,11 @@
     <w:p>
       <w:pPr>
         <w:pStyle w:val="ListParagraph"/>
-        <w:keepLines/>
-        <w:numPr>
-          <w:ilvl w:val="0"/>
-          <w:numId w:val="2"/>
-        </w:numPr>
-        <w:spacing w:after="45" w:line="240"/>
+        <w:numPr>
+          <w:ilvl w:val="0"/>
+          <w:numId w:val="2"/>
+        </w:numPr>
+        <w:spacing w:after="30"/>
       </w:pPr>
       <w:r>
         <w:rPr>
@@ -1057,12 +1041,11 @@
     <w:p>
       <w:pPr>
         <w:pStyle w:val="ListParagraph"/>
-        <w:keepLines/>
-        <w:numPr>
-          <w:ilvl w:val="0"/>
-          <w:numId w:val="2"/>
-        </w:numPr>
-        <w:spacing w:after="45" w:line="240"/>
+        <w:numPr>
+          <w:ilvl w:val="0"/>
+          <w:numId w:val="2"/>
+        </w:numPr>
+        <w:spacing w:after="30"/>
       </w:pPr>
       <w:r>
         <w:rPr>
@@ -1076,12 +1059,11 @@
     <w:p>
       <w:pPr>
         <w:pStyle w:val="ListParagraph"/>
-        <w:keepLines/>
-        <w:numPr>
-          <w:ilvl w:val="0"/>
-          <w:numId w:val="2"/>
-        </w:numPr>
-        <w:spacing w:after="45" w:line="240"/>
+        <w:numPr>
+          <w:ilvl w:val="0"/>
+          <w:numId w:val="2"/>
+        </w:numPr>
+        <w:spacing w:after="30"/>
       </w:pPr>
       <w:r>
         <w:rPr>
@@ -1095,12 +1077,11 @@
     <w:p>
       <w:pPr>
         <w:pStyle w:val="ListParagraph"/>
-        <w:keepLines/>
-        <w:numPr>
-          <w:ilvl w:val="0"/>
-          <w:numId w:val="2"/>
-        </w:numPr>
-        <w:spacing w:after="45" w:line="240"/>
+        <w:numPr>
+          <w:ilvl w:val="0"/>
+          <w:numId w:val="2"/>
+        </w:numPr>
+        <w:spacing w:after="30"/>
       </w:pPr>
       <w:r>
         <w:rPr>
@@ -1117,7 +1098,7 @@
         <w:pBdr>
           <w:bottom w:val="single" w:color="1B4F9C" w:sz="8" w:space="3"/>
         </w:pBdr>
-        <w:spacing w:after="110" w:before="240"/>
+        <w:spacing w:after="140" w:before="240"/>
       </w:pPr>
       <w:r>
         <w:rPr>
@@ -1125,6 +1106,7 @@
           <w:b/>
           <w:bCs/>
           <w:color w:val="1B4F9C"/>
+          <w:spacing w:val="30"/>
           <w:sz w:val="22"/>
           <w:szCs w:val="22"/>
         </w:rPr>
@@ -1134,11 +1116,10 @@
     <w:p>
       <w:pPr>
         <w:keepNext/>
-        <w:keepLines/>
         <w:tabs>
           <w:tab w:val="right" w:pos="10368"/>
         </w:tabs>
-        <w:spacing w:after="0" w:before="150"/>
+        <w:spacing w:after="0" w:before="0"/>
       </w:pPr>
       <w:r>
         <w:rPr>
@@ -1150,7 +1131,7 @@
         </w:rPr>
         <w:t xml:space="preserve">Juice Bros, </w:t>
       </w:r>
-      <w:hyperlink w:history="1" r:id="rIdvxdybfflgktx2lsgoy7j_">
+      <w:hyperlink w:history="1" r:id="rIdsr62avpbrrhemgavvpysk">
         <w:r>
           <w:rPr>
             <w:rFonts w:ascii="Calibri" w:cs="Calibri" w:eastAsia="Calibri" w:hAnsi="Calibri"/>
@@ -1170,19 +1151,17 @@
           <w:sz w:val="19"/>
           <w:szCs w:val="19"/>
         </w:rPr>
-        <w:tab/>
-        <w:t xml:space="preserve">2026</w:t>
-      </w:r>
-    </w:p>
-    <w:p>
-      <w:pPr>
-        <w:pStyle w:val="ListParagraph"/>
-        <w:keepLines/>
-        <w:numPr>
-          <w:ilvl w:val="0"/>
-          <w:numId w:val="2"/>
-        </w:numPr>
-        <w:spacing w:after="45" w:line="240"/>
+        <w:t xml:space="preserve">	2026</w:t>
+      </w:r>
+    </w:p>
+    <w:p>
+      <w:pPr>
+        <w:pStyle w:val="ListParagraph"/>
+        <w:numPr>
+          <w:ilvl w:val="0"/>
+          <w:numId w:val="2"/>
+        </w:numPr>
+        <w:spacing w:after="30"/>
       </w:pPr>
       <w:r>
         <w:rPr>
@@ -1199,7 +1178,7 @@
         <w:pBdr>
           <w:bottom w:val="single" w:color="1B4F9C" w:sz="8" w:space="3"/>
         </w:pBdr>
-        <w:spacing w:after="110" w:before="240"/>
+        <w:spacing w:after="140" w:before="240"/>
       </w:pPr>
       <w:r>
         <w:rPr>
@@ -1207,6 +1186,7 @@
           <w:b/>
           <w:bCs/>
           <w:color w:val="1B4F9C"/>
+          <w:spacing w:val="30"/>
           <w:sz w:val="22"/>
           <w:szCs w:val="22"/>
         </w:rPr>
@@ -1218,25 +1198,25 @@
         <w:tabs>
           <w:tab w:val="right" w:pos="10368"/>
         </w:tabs>
-        <w:spacing w:after="45"/>
-      </w:pPr>
-      <w:r>
-        <w:rPr>
-          <w:rFonts w:ascii="Calibri" w:cs="Calibri" w:eastAsia="Calibri" w:hAnsi="Calibri"/>
-          <w:b/>
-          <w:bCs/>
-          <w:sz w:val="20"/>
-          <w:szCs w:val="20"/>
-        </w:rPr>
-        <w:t xml:space="preserve">Seneca College  </w:t>
-      </w:r>
-      <w:r>
-        <w:rPr>
-          <w:rFonts w:ascii="Calibri" w:cs="Calibri" w:eastAsia="Calibri" w:hAnsi="Calibri"/>
-          <w:sz w:val="20"/>
-          <w:szCs w:val="20"/>
-        </w:rPr>
-        <w:t xml:space="preserve">Webmaster Content Site Design Certificate</w:t>
+        <w:spacing w:after="40"/>
+      </w:pPr>
+      <w:r>
+        <w:rPr>
+          <w:rFonts w:ascii="Calibri" w:cs="Calibri" w:eastAsia="Calibri" w:hAnsi="Calibri"/>
+          <w:b/>
+          <w:bCs/>
+          <w:sz w:val="20"/>
+          <w:szCs w:val="20"/>
+        </w:rPr>
+        <w:t xml:space="preserve">Seneca College</w:t>
+      </w:r>
+      <w:r>
+        <w:rPr>
+          <w:rFonts w:ascii="Calibri" w:cs="Calibri" w:eastAsia="Calibri" w:hAnsi="Calibri"/>
+          <w:sz w:val="20"/>
+          <w:szCs w:val="20"/>
+        </w:rPr>
+        <w:t xml:space="preserve">  Webmaster Content Site Design Certificate</w:t>
       </w:r>
       <w:r>
         <w:rPr>
@@ -1245,8 +1225,7 @@
           <w:sz w:val="19"/>
           <w:szCs w:val="19"/>
         </w:rPr>
-        <w:tab/>
-        <w:t xml:space="preserve">2017</w:t>
+        <w:t xml:space="preserve">	2017</w:t>
       </w:r>
     </w:p>
     <w:p>
@@ -1254,25 +1233,25 @@
         <w:tabs>
           <w:tab w:val="right" w:pos="10368"/>
         </w:tabs>
-        <w:spacing w:after="45"/>
-      </w:pPr>
-      <w:r>
-        <w:rPr>
-          <w:rFonts w:ascii="Calibri" w:cs="Calibri" w:eastAsia="Calibri" w:hAnsi="Calibri"/>
-          <w:b/>
-          <w:bCs/>
-          <w:sz w:val="20"/>
-          <w:szCs w:val="20"/>
-        </w:rPr>
-        <w:t xml:space="preserve">Seneca College  </w:t>
-      </w:r>
-      <w:r>
-        <w:rPr>
-          <w:rFonts w:ascii="Calibri" w:cs="Calibri" w:eastAsia="Calibri" w:hAnsi="Calibri"/>
-          <w:sz w:val="20"/>
-          <w:szCs w:val="20"/>
-        </w:rPr>
-        <w:t xml:space="preserve">Computer Engineering Technology &amp; Marketing</w:t>
+        <w:spacing w:after="40"/>
+      </w:pPr>
+      <w:r>
+        <w:rPr>
+          <w:rFonts w:ascii="Calibri" w:cs="Calibri" w:eastAsia="Calibri" w:hAnsi="Calibri"/>
+          <w:b/>
+          <w:bCs/>
+          <w:sz w:val="20"/>
+          <w:szCs w:val="20"/>
+        </w:rPr>
+        <w:t xml:space="preserve">Seneca College</w:t>
+      </w:r>
+      <w:r>
+        <w:rPr>
+          <w:rFonts w:ascii="Calibri" w:cs="Calibri" w:eastAsia="Calibri" w:hAnsi="Calibri"/>
+          <w:sz w:val="20"/>
+          <w:szCs w:val="20"/>
+        </w:rPr>
+        <w:t xml:space="preserve">  Computer Engineering Technology &amp; Marketing</w:t>
       </w:r>
       <w:r>
         <w:rPr>
@@ -1281,8 +1260,7 @@
           <w:sz w:val="19"/>
           <w:szCs w:val="19"/>
         </w:rPr>
-        <w:tab/>
-        <w:t xml:space="preserve">2014 - 2016</w:t>
+        <w:t xml:space="preserve">	2014 - 2016</w:t>
       </w:r>
     </w:p>
     <w:p>
@@ -1290,25 +1268,25 @@
         <w:tabs>
           <w:tab w:val="right" w:pos="10368"/>
         </w:tabs>
-        <w:spacing w:after="45"/>
-      </w:pPr>
-      <w:r>
-        <w:rPr>
-          <w:rFonts w:ascii="Calibri" w:cs="Calibri" w:eastAsia="Calibri" w:hAnsi="Calibri"/>
-          <w:b/>
-          <w:bCs/>
-          <w:sz w:val="20"/>
-          <w:szCs w:val="20"/>
-        </w:rPr>
-        <w:t xml:space="preserve">University of Ottawa  </w:t>
-      </w:r>
-      <w:r>
-        <w:rPr>
-          <w:rFonts w:ascii="Calibri" w:cs="Calibri" w:eastAsia="Calibri" w:hAnsi="Calibri"/>
-          <w:sz w:val="20"/>
-          <w:szCs w:val="20"/>
-        </w:rPr>
-        <w:t xml:space="preserve">Electrical Engineering</w:t>
+        <w:spacing w:after="40"/>
+      </w:pPr>
+      <w:r>
+        <w:rPr>
+          <w:rFonts w:ascii="Calibri" w:cs="Calibri" w:eastAsia="Calibri" w:hAnsi="Calibri"/>
+          <w:b/>
+          <w:bCs/>
+          <w:sz w:val="20"/>
+          <w:szCs w:val="20"/>
+        </w:rPr>
+        <w:t xml:space="preserve">University of Ottawa</w:t>
+      </w:r>
+      <w:r>
+        <w:rPr>
+          <w:rFonts w:ascii="Calibri" w:cs="Calibri" w:eastAsia="Calibri" w:hAnsi="Calibri"/>
+          <w:sz w:val="20"/>
+          <w:szCs w:val="20"/>
+        </w:rPr>
+        <w:t xml:space="preserve">  Electrical Engineering</w:t>
       </w:r>
       <w:r>
         <w:rPr>
@@ -1317,13 +1295,12 @@
           <w:sz w:val="19"/>
           <w:szCs w:val="19"/>
         </w:rPr>
-        <w:tab/>
-        <w:t xml:space="preserve">2012 - 2014</w:t>
+        <w:t xml:space="preserve">	2012 - 2014</w:t>
       </w:r>
     </w:p>
     <w:sectPr>
       <w:pgSz w:w="12240" w:h="15840" w:orient="portrait"/>
-      <w:pgMar w:top="792" w:right="936" w:bottom="792" w:left="936" w:header="708" w:footer="708" w:gutter="0"/>
+      <w:pgMar w:top="720" w:right="936" w:bottom="720" w:left="936" w:header="708" w:footer="708" w:gutter="0"/>
       <w:pgNumType/>
       <w:docGrid w:linePitch="360"/>
     </w:sectPr>
@@ -1503,7 +1480,7 @@
       <w:lvlText w:val="•"/>
       <w:lvlJc w:val="left"/>
       <w:pPr>
-        <w:ind w:left="316" w:hanging="215"/>
+        <w:ind w:left="316" w:hanging="214"/>
       </w:pPr>
     </w:lvl>
   </w:abstractNum>
@@ -1525,7 +1502,13 @@
 <file path=word/styles.xml><?xml version="1.0" encoding="utf-8"?>
 <w:styles xmlns:mc="http://schemas.openxmlformats.org/markup-compatibility/2006" xmlns:r="http://schemas.openxmlformats.org/officeDocument/2006/relationships" xmlns:w="http://schemas.openxmlformats.org/wordprocessingml/2006/main" xmlns:w14="http://schemas.microsoft.com/office/word/2010/wordml" xmlns:w15="http://schemas.microsoft.com/office/word/2012/wordml" mc:Ignorable="w14 w15">
   <w:docDefaults>
-    <w:rPrDefault/>
+    <w:rPrDefault>
+      <w:rPr>
+        <w:rFonts w:ascii="Calibri" w:cs="Calibri" w:eastAsia="Calibri" w:hAnsi="Calibri"/>
+        <w:sz w:val="20"/>
+        <w:szCs w:val="20"/>
+      </w:rPr>
+    </w:rPrDefault>
     <w:pPrDefault/>
   </w:docDefaults>
   <w:style w:type="paragraph" w:styleId="Title">

</xml_diff>